<commit_message>
Revisión y actualización final de la memoria
</commit_message>
<xml_diff>
--- a/docs/PlateUp_Memoria_Tecnica_v7.docx
+++ b/docs/PlateUp_Memoria_Tecnica_v7.docx
@@ -66,18 +66,7 @@
           <w:sz w:val="28"/>
           <w:szCs w:val="28"/>
         </w:rPr>
-        <w:t>La mejor red</w:t>
-      </w:r>
-      <w:r>
-        <w:rPr>
-          <w:rFonts w:eastAsia="Arial" w:cs="Arial"/>
-          <w:i/>
-          <w:iCs/>
-          <w:color w:val="666666"/>
-          <w:sz w:val="28"/>
-          <w:szCs w:val="28"/>
-        </w:rPr>
-        <w:t xml:space="preserve"> social de cocina multiplataforma</w:t>
+        <w:t>La mejor red social de cocina multiplataforma</w:t>
       </w:r>
     </w:p>
     <w:p>
@@ -410,43 +399,7 @@
                 <w:sz w:val="22"/>
                 <w:szCs w:val="22"/>
               </w:rPr>
-              <w:t>2</w:t>
-            </w:r>
-            <w:r>
-              <w:rPr>
-                <w:rFonts w:eastAsia="Arial" w:cs="Arial"/>
-                <w:color w:val="1A1A2E"/>
-                <w:sz w:val="22"/>
-                <w:szCs w:val="22"/>
-              </w:rPr>
-              <w:t>5</w:t>
-            </w:r>
-            <w:r>
-              <w:rPr>
-                <w:rFonts w:eastAsia="Arial" w:cs="Arial"/>
-                <w:color w:val="1A1A2E"/>
-                <w:sz w:val="22"/>
-                <w:szCs w:val="22"/>
-              </w:rPr>
-              <w:t xml:space="preserve"> de </w:t>
-            </w:r>
-            <w:r>
-              <w:rPr>
-                <w:rFonts w:eastAsia="Arial" w:cs="Arial"/>
-                <w:color w:val="1A1A2E"/>
-                <w:sz w:val="22"/>
-                <w:szCs w:val="22"/>
-              </w:rPr>
-              <w:t>mayo</w:t>
-            </w:r>
-            <w:r>
-              <w:rPr>
-                <w:rFonts w:eastAsia="Arial" w:cs="Arial"/>
-                <w:color w:val="1A1A2E"/>
-                <w:sz w:val="22"/>
-                <w:szCs w:val="22"/>
-              </w:rPr>
-              <w:t xml:space="preserve"> de 2026</w:t>
+              <w:t>25 de mayo de 2026</w:t>
             </w:r>
           </w:p>
         </w:tc>
@@ -520,7 +473,7 @@
       <w:r>
         <w:rPr/>
         <w:drawing>
-          <wp:anchor behindDoc="1" distT="114300" distB="114300" distL="114300" distR="114300" simplePos="0" locked="0" layoutInCell="0" allowOverlap="1" relativeHeight="26">
+          <wp:anchor behindDoc="0" distT="114300" distB="114300" distL="114300" distR="114300" simplePos="0" locked="0" layoutInCell="0" allowOverlap="1" relativeHeight="26">
             <wp:simplePos x="0" y="0"/>
             <wp:positionH relativeFrom="column">
               <wp:posOffset>11430</wp:posOffset>
@@ -5407,7 +5360,7 @@
           <w:sz w:val="22"/>
           <w:szCs w:val="22"/>
         </w:rPr>
-        <w:t>Desplegar el sistema en producción con Railway y Railway, configurando correctamente las variables de entorno y los servicios Docker.</w:t>
+        <w:t>Desplegar el sistema en producción con Railway, configurando correctamente las variables de entorno y los servicios Docker.</w:t>
       </w:r>
     </w:p>
     <w:p>
@@ -6277,15 +6230,7 @@
             </w:pPr>
             <w:r>
               <w:rPr/>
-              <w:t xml:space="preserve">Últimos retoques funcionales, versión Android con Capacitor, despliegue en Railway </w:t>
-            </w:r>
-            <w:r>
-              <w:rPr/>
-              <w:t>y</w:t>
-            </w:r>
-            <w:r>
-              <w:rPr/>
-              <w:t xml:space="preserve"> elaboración de la memoria. </w:t>
+              <w:t xml:space="preserve">Últimos retoques funcionales, versión Android con Capacitor, despliegue en Railway y elaboración de la memoria. </w:t>
             </w:r>
           </w:p>
         </w:tc>
@@ -6657,7 +6602,25 @@
                 <w:sz w:val="22"/>
                 <w:szCs w:val="22"/>
               </w:rPr>
-              <w:t>JSON es el formato exclusivo de intercambio de información entre el frontend Vue.js y la API REST del backend. Cada respuesta del servidor es un documento JSON bien estructurado con propiedades descriptivas. La estructura HTML semántica de la aplicación web utiliza etiquetas appropriadas (header, nav, main, section, article) para una estructura lógica. El archivo AndroidManifest.xml del proyecto Android está correctamente estructurado con permisos, intenciones y configuraciones. Los archivos de configuración del proyecto en formato YAML (docker-compose.yml, railway.toml) y .properties permiten la parametrización del sistema sin modificar el código. Se utilizan archivos .env para la gestión de variables sensibles. La validación de los datos recibidos en la API mediante Spring Validation asegura que los datos cumplen restricciones (campos requeridos, formato de email válido, longitudes máximas).</w:t>
+              <w:t xml:space="preserve">JSON es el formato exclusivo de intercambio de información entre el frontend Vue.js y la API REST del backend. Cada respuesta del servidor es un documento JSON bien estructurado con propiedades descriptivas. La estructura HTML semántica de la aplicación web utiliza etiquetas </w:t>
+            </w:r>
+            <w:r>
+              <w:rPr>
+                <w:rFonts w:eastAsia="Arial" w:cs="Arial"/>
+                <w:color w:val="1A1A2E"/>
+                <w:sz w:val="22"/>
+                <w:szCs w:val="22"/>
+              </w:rPr>
+              <w:t>apropiadas</w:t>
+            </w:r>
+            <w:r>
+              <w:rPr>
+                <w:rFonts w:eastAsia="Arial" w:cs="Arial"/>
+                <w:color w:val="1A1A2E"/>
+                <w:sz w:val="22"/>
+                <w:szCs w:val="22"/>
+              </w:rPr>
+              <w:t xml:space="preserve"> (header, nav, main, section, article) para una estructura lógica. El archivo AndroidManifest.xml del proyecto Android está correctamente estructurado con permisos, intenciones y configuraciones. Los archivos de configuración del proyecto en formato YAML (docker-compose.yml, railway.toml) y .properties permiten la parametrización del sistema sin modificar el código. Se utilizan archivos .env para la gestión de variables sensibles. La validación de los datos recibidos en la API mediante Spring Validation asegura que los datos cumplen restricciones (campos requeridos, formato de email válido, longitudes máximas).</w:t>
             </w:r>
           </w:p>
         </w:tc>
@@ -10053,7 +10016,7 @@
           <w:sz w:val="22"/>
           <w:szCs w:val="22"/>
         </w:rPr>
-        <w:t>Docker fue elegido para el despliegue por garantizar que la aplicación funciona exactamente igual en cualquier entorno, eliminando el clásico problema de 'funciona en mi máquina'.Railway fue elegido como plataforma de despliegue en la nube por ofrecer un plan gratuito que permite desplegar tanto servicios web Docker como sitios estáticos, con HTTPS automático y despliegue continuo desde GitHub. Railway fue elegido para la base de datos gestionada por las razones mencionadas anteriormente.</w:t>
+        <w:t>Docker fue elegido para el despliegue por garantizar que la aplicación funciona exactamente igual en cualquier entorno, eliminando el clásico problema de 'funciona en mi máquina'. Railway fue elegido como plataforma de despliegue en la nube por ofrecer un plan gratuito que permite desplegar tanto servicios web Docker como sitios estáticos, con HTTPS automático y despliegue continuo desde GitHub.</w:t>
       </w:r>
     </w:p>
     <w:p>
@@ -15475,25 +15438,7 @@
           <w:sz w:val="22"/>
           <w:szCs w:val="22"/>
         </w:rPr>
-        <w:t xml:space="preserve">La versión Android de PlateUp se desarrolló utilizando Capacitor </w:t>
-      </w:r>
-      <w:r>
-        <w:rPr>
-          <w:rFonts w:eastAsia="Arial" w:cs="Arial"/>
-          <w:color w:val="1A1A2E"/>
-          <w:sz w:val="22"/>
-          <w:szCs w:val="22"/>
-        </w:rPr>
-        <w:t>8</w:t>
-      </w:r>
-      <w:r>
-        <w:rPr>
-          <w:rFonts w:eastAsia="Arial" w:cs="Arial"/>
-          <w:color w:val="1A1A2E"/>
-          <w:sz w:val="22"/>
-          <w:szCs w:val="22"/>
-        </w:rPr>
-        <w:t>, que transforma la aplicación Vue.js en una aplicación Android instalable. El proceso de desarrollo siguió estos pasos:</w:t>
+        <w:t>La versión Android de PlateUp se desarrolló utilizando Capacitor 8, que transforma la aplicación Vue.js en una aplicación Android instalable. El proceso de desarrollo siguió estos pasos:</w:t>
       </w:r>
     </w:p>
     <w:p>
@@ -15941,17 +15886,7 @@
           <w:sz w:val="26"/>
           <w:szCs w:val="26"/>
         </w:rPr>
-        <w:t xml:space="preserve">Pruebas </w:t>
-      </w:r>
-      <w:r>
-        <w:rPr>
-          <w:b/>
-          <w:bCs/>
-          <w:color w:val="E04528"/>
-          <w:sz w:val="26"/>
-          <w:szCs w:val="26"/>
-        </w:rPr>
-        <w:t>con usuarios reales</w:t>
+        <w:t>Pruebas con usuarios reales</w:t>
       </w:r>
     </w:p>
     <w:p>
@@ -19442,29 +19377,7 @@
           <w:sz w:val="22"/>
           <w:szCs w:val="22"/>
         </w:rPr>
-        <w:t xml:space="preserve">KPIs en cuadrícula 2x2: número total de usuarios, número total de recetas, total de likes dados y total de </w:t>
-      </w:r>
-      <w:r>
-        <w:rPr>
-          <w:rFonts w:eastAsia="Arial" w:cs="Arial"/>
-          <w:b w:val="false"/>
-          <w:bCs w:val="false"/>
-          <w:color w:val="1A1A2E"/>
-          <w:sz w:val="22"/>
-          <w:szCs w:val="22"/>
-        </w:rPr>
-        <w:t>recetas cocinadas totales</w:t>
-      </w:r>
-      <w:r>
-        <w:rPr>
-          <w:rFonts w:eastAsia="Arial" w:cs="Arial"/>
-          <w:b w:val="false"/>
-          <w:bCs w:val="false"/>
-          <w:color w:val="1A1A2E"/>
-          <w:sz w:val="22"/>
-          <w:szCs w:val="22"/>
-        </w:rPr>
-        <w:t>. Los datos se cargan desde el endpoint del AdminController.</w:t>
+        <w:t>KPIs en cuadrícula 2x2: número total de usuarios, número total de recetas, total de likes dados y total de recetas cocinadas totales. Los datos se cargan desde el endpoint del AdminController.</w:t>
       </w:r>
     </w:p>
     <w:p>
@@ -19798,8 +19711,34 @@
           <w:sz w:val="32"/>
           <w:szCs w:val="32"/>
         </w:rPr>
-        <w:t>9.</w:t>
-      </w:r>
+        <w:t>9.6 Mejoras en el sistema de gamificación</w:t>
+      </w:r>
+    </w:p>
+    <w:p>
+      <w:pPr>
+        <w:pStyle w:val="Normal"/>
+        <w:spacing w:before="80" w:after="160"/>
+        <w:jc w:val="both"/>
+        <w:rPr/>
+      </w:pPr>
+      <w:r>
+        <w:rPr>
+          <w:rFonts w:eastAsia="Arial" w:cs="Arial"/>
+          <w:color w:val="1A1A2E"/>
+          <w:sz w:val="22"/>
+          <w:szCs w:val="22"/>
+        </w:rPr>
+        <w:t>Ampliar el sistema de gamificación con temporadas (seasons) de desafíos con clasificaciones globales, eventos especiales relacionados con festividades gastronómicas (Semana Santa, Navidad, etc.), rankings semanales de los usuarios más activos, y sistema de niveles de experiencia para el perfil de usuario.</w:t>
+      </w:r>
+    </w:p>
+    <w:p>
+      <w:pPr>
+        <w:pStyle w:val="Heading2"/>
+        <w:spacing w:before="320" w:after="180"/>
+        <w:rPr/>
+      </w:pPr>
+      <w:bookmarkStart w:id="173" w:name="__RefHeading___Toc1966_836002287"/>
+      <w:bookmarkEnd w:id="173"/>
       <w:r>
         <w:rPr>
           <w:rFonts w:eastAsia="Arial" w:cs="Arial"/>
@@ -19809,8 +19748,34 @@
           <w:sz w:val="32"/>
           <w:szCs w:val="32"/>
         </w:rPr>
-        <w:t>6</w:t>
-      </w:r>
+        <w:t>9.7 Internacionalización (i18n)</w:t>
+      </w:r>
+    </w:p>
+    <w:p>
+      <w:pPr>
+        <w:pStyle w:val="Normal"/>
+        <w:spacing w:before="80" w:after="160"/>
+        <w:jc w:val="both"/>
+        <w:rPr/>
+      </w:pPr>
+      <w:r>
+        <w:rPr>
+          <w:rFonts w:eastAsia="Arial" w:cs="Arial"/>
+          <w:color w:val="1A1A2E"/>
+          <w:sz w:val="22"/>
+          <w:szCs w:val="22"/>
+        </w:rPr>
+        <w:t>Implementar soporte para múltiples idiomas en la interfaz mediante la librería vue-i18n para el frontend y configuraciones de locale en el backend. La prioridad sería el español, inglés y italiano, con posibilidad de ampliar a otros idiomas europeos.</w:t>
+      </w:r>
+    </w:p>
+    <w:p>
+      <w:pPr>
+        <w:pStyle w:val="Heading2"/>
+        <w:spacing w:before="320" w:after="180"/>
+        <w:rPr/>
+      </w:pPr>
+      <w:bookmarkStart w:id="174" w:name="__RefHeading___Toc1968_836002287"/>
+      <w:bookmarkEnd w:id="174"/>
       <w:r>
         <w:rPr>
           <w:rFonts w:eastAsia="Arial" w:cs="Arial"/>
@@ -19820,7 +19785,7 @@
           <w:sz w:val="32"/>
           <w:szCs w:val="32"/>
         </w:rPr>
-        <w:t xml:space="preserve"> Mejoras en el sistema de gamificación</w:t>
+        <w:t>9.8 Almacenamiento de imágenes en CDN</w:t>
       </w:r>
     </w:p>
     <w:p>
@@ -19837,7 +19802,7 @@
           <w:sz w:val="22"/>
           <w:szCs w:val="22"/>
         </w:rPr>
-        <w:t>Ampliar el sistema de gamificación con temporadas (seasons) de desafíos con clasificaciones globales, eventos especiales relacionados con festividades gastronómicas (Semana Santa, Navidad, etc.), rankings semanales de los usuarios más activos, y sistema de niveles de experiencia para el perfil de usuario.</w:t>
+        <w:t>Migrar el almacenamiento de imágenes del servidor local de Railway a un servicio CDN especializado como Cloudinary, AWS S3 + CloudFront. Esto mejoraría significativamente los tiempos de carga de imágenes gracias a la distribución geográfica del contenido, reduciría la carga del servidor principal y eliminaría la pérdida de imágenes cuando el servidor de Railway se reinicia (en el plan gratuito el almacenamiento local es efímero).</w:t>
       </w:r>
     </w:p>
     <w:p>
@@ -19846,8 +19811,8 @@
         <w:spacing w:before="320" w:after="180"/>
         <w:rPr/>
       </w:pPr>
-      <w:bookmarkStart w:id="173" w:name="__RefHeading___Toc1966_836002287"/>
-      <w:bookmarkEnd w:id="173"/>
+      <w:bookmarkStart w:id="175" w:name="__RefHeading___Toc1970_836002287"/>
+      <w:bookmarkEnd w:id="175"/>
       <w:r>
         <w:rPr>
           <w:rFonts w:eastAsia="Arial" w:cs="Arial"/>
@@ -19857,8 +19822,39 @@
           <w:sz w:val="32"/>
           <w:szCs w:val="32"/>
         </w:rPr>
-        <w:t>9.</w:t>
-      </w:r>
+        <w:t>9.9 Sistema de reportes y moderación</w:t>
+      </w:r>
+    </w:p>
+    <w:p>
+      <w:pPr>
+        <w:pStyle w:val="Normal"/>
+        <w:spacing w:before="80" w:after="160"/>
+        <w:jc w:val="both"/>
+        <w:rPr>
+          <w:rFonts w:eastAsia="Arial" w:cs="Arial"/>
+          <w:color w:val="1A1A2E"/>
+          <w:sz w:val="22"/>
+          <w:szCs w:val="22"/>
+        </w:rPr>
+      </w:pPr>
+      <w:r>
+        <w:rPr>
+          <w:rFonts w:eastAsia="Arial" w:cs="Arial"/>
+          <w:color w:val="1A1A2E"/>
+          <w:sz w:val="22"/>
+          <w:szCs w:val="22"/>
+        </w:rPr>
+        <w:t>Implementar el sistema de reportes de contenido inapropiado cuya tabla (Reports) ya está definida en la base de datos. Los usuarios podrían reportar recetas o comentarios que incumplan las normas de la comunidad. El administrador tendría acceso a una cola de reportes pendientes de revisión desde el panel de administración, con opciones para aprobar, rechazar o eliminar el contenido reportado. Esta tarea se podría automatizar con un agente de IA que decida si eliminar o no una publicación.</w:t>
+      </w:r>
+    </w:p>
+    <w:p>
+      <w:pPr>
+        <w:pStyle w:val="Heading2"/>
+        <w:spacing w:before="320" w:after="180"/>
+        <w:rPr/>
+      </w:pPr>
+      <w:bookmarkStart w:id="176" w:name="__RefHeading___Toc1970_836002287_Copia_1"/>
+      <w:bookmarkEnd w:id="176"/>
       <w:r>
         <w:rPr>
           <w:rFonts w:eastAsia="Arial" w:cs="Arial"/>
@@ -19868,200 +19864,7 @@
           <w:sz w:val="32"/>
           <w:szCs w:val="32"/>
         </w:rPr>
-        <w:t>7</w:t>
-      </w:r>
-      <w:r>
-        <w:rPr>
-          <w:rFonts w:eastAsia="Arial" w:cs="Arial"/>
-          <w:b/>
-          <w:bCs/>
-          <w:color w:val="1B3A5C"/>
-          <w:sz w:val="32"/>
-          <w:szCs w:val="32"/>
-        </w:rPr>
-        <w:t xml:space="preserve"> Internacionalización (i18n)</w:t>
-      </w:r>
-    </w:p>
-    <w:p>
-      <w:pPr>
-        <w:pStyle w:val="Normal"/>
-        <w:spacing w:before="80" w:after="160"/>
-        <w:jc w:val="both"/>
-        <w:rPr/>
-      </w:pPr>
-      <w:r>
-        <w:rPr>
-          <w:rFonts w:eastAsia="Arial" w:cs="Arial"/>
-          <w:color w:val="1A1A2E"/>
-          <w:sz w:val="22"/>
-          <w:szCs w:val="22"/>
-        </w:rPr>
-        <w:t>Implementar soporte para múltiples idiomas en la interfaz mediante la librería vue-i18n para el frontend y configuraciones de locale en el backend. La prioridad sería el español, inglés y italiano, con posibilidad de ampliar a otros idiomas europeos.</w:t>
-      </w:r>
-    </w:p>
-    <w:p>
-      <w:pPr>
-        <w:pStyle w:val="Heading2"/>
-        <w:spacing w:before="320" w:after="180"/>
-        <w:rPr/>
-      </w:pPr>
-      <w:bookmarkStart w:id="174" w:name="__RefHeading___Toc1968_836002287"/>
-      <w:bookmarkEnd w:id="174"/>
-      <w:r>
-        <w:rPr>
-          <w:rFonts w:eastAsia="Arial" w:cs="Arial"/>
-          <w:b/>
-          <w:bCs/>
-          <w:color w:val="1B3A5C"/>
-          <w:sz w:val="32"/>
-          <w:szCs w:val="32"/>
-        </w:rPr>
-        <w:t>9.</w:t>
-      </w:r>
-      <w:r>
-        <w:rPr>
-          <w:rFonts w:eastAsia="Arial" w:cs="Arial"/>
-          <w:b/>
-          <w:bCs/>
-          <w:color w:val="1B3A5C"/>
-          <w:sz w:val="32"/>
-          <w:szCs w:val="32"/>
-        </w:rPr>
-        <w:t>8</w:t>
-      </w:r>
-      <w:r>
-        <w:rPr>
-          <w:rFonts w:eastAsia="Arial" w:cs="Arial"/>
-          <w:b/>
-          <w:bCs/>
-          <w:color w:val="1B3A5C"/>
-          <w:sz w:val="32"/>
-          <w:szCs w:val="32"/>
-        </w:rPr>
-        <w:t xml:space="preserve"> Almacenamiento de imágenes en CDN</w:t>
-      </w:r>
-    </w:p>
-    <w:p>
-      <w:pPr>
-        <w:pStyle w:val="Normal"/>
-        <w:spacing w:before="80" w:after="160"/>
-        <w:jc w:val="both"/>
-        <w:rPr/>
-      </w:pPr>
-      <w:r>
-        <w:rPr>
-          <w:rFonts w:eastAsia="Arial" w:cs="Arial"/>
-          <w:color w:val="1A1A2E"/>
-          <w:sz w:val="22"/>
-          <w:szCs w:val="22"/>
-        </w:rPr>
-        <w:t>Migrar el almacenamiento de imágenes del servidor local de Railway a un servicio CDN especializado como Cloudinary, AWS S3 + CloudFront. Esto mejoraría significativamente los tiempos de carga de imágenes gracias a la distribución geográfica del contenido, reduciría la carga del servidor principal y eliminaría la pérdida de imágenes cuando el servidor de Railway se reinicia (en el plan gratuito el almacenamiento local es efímero).</w:t>
-      </w:r>
-    </w:p>
-    <w:p>
-      <w:pPr>
-        <w:pStyle w:val="Heading2"/>
-        <w:spacing w:before="320" w:after="180"/>
-        <w:rPr/>
-      </w:pPr>
-      <w:bookmarkStart w:id="175" w:name="__RefHeading___Toc1970_836002287"/>
-      <w:bookmarkEnd w:id="175"/>
-      <w:r>
-        <w:rPr>
-          <w:rFonts w:eastAsia="Arial" w:cs="Arial"/>
-          <w:b/>
-          <w:bCs/>
-          <w:color w:val="1B3A5C"/>
-          <w:sz w:val="32"/>
-          <w:szCs w:val="32"/>
-        </w:rPr>
-        <w:t>9.</w:t>
-      </w:r>
-      <w:r>
-        <w:rPr>
-          <w:rFonts w:eastAsia="Arial" w:cs="Arial"/>
-          <w:b/>
-          <w:bCs/>
-          <w:color w:val="1B3A5C"/>
-          <w:sz w:val="32"/>
-          <w:szCs w:val="32"/>
-        </w:rPr>
-        <w:t>9</w:t>
-      </w:r>
-      <w:r>
-        <w:rPr>
-          <w:rFonts w:eastAsia="Arial" w:cs="Arial"/>
-          <w:b/>
-          <w:bCs/>
-          <w:color w:val="1B3A5C"/>
-          <w:sz w:val="32"/>
-          <w:szCs w:val="32"/>
-        </w:rPr>
-        <w:t xml:space="preserve"> Sistema de reportes y moderación</w:t>
-      </w:r>
-    </w:p>
-    <w:p>
-      <w:pPr>
-        <w:pStyle w:val="Normal"/>
-        <w:spacing w:before="80" w:after="160"/>
-        <w:jc w:val="both"/>
-        <w:rPr>
-          <w:rFonts w:eastAsia="Arial" w:cs="Arial"/>
-          <w:color w:val="1A1A2E"/>
-          <w:sz w:val="22"/>
-          <w:szCs w:val="22"/>
-        </w:rPr>
-      </w:pPr>
-      <w:r>
-        <w:rPr>
-          <w:rFonts w:eastAsia="Arial" w:cs="Arial"/>
-          <w:color w:val="1A1A2E"/>
-          <w:sz w:val="22"/>
-          <w:szCs w:val="22"/>
-        </w:rPr>
-        <w:t>Implementar el sistema de reportes de contenido inapropiado cuya tabla (Reports) ya está definida en la base de datos. Los usuarios podrían reportar recetas o comentarios que incumplan las normas de la comunidad. El administrador tendría acceso a una cola de reportes pendientes de revisión desde el panel de administración, con opciones para aprobar, rechazar o eliminar el contenido reportado. Esta tarea se podría automatizar con un agente de IA que decida si eliminar o no una publicación.</w:t>
-      </w:r>
-    </w:p>
-    <w:p>
-      <w:pPr>
-        <w:pStyle w:val="Heading2"/>
-        <w:spacing w:before="320" w:after="180"/>
-        <w:rPr/>
-      </w:pPr>
-      <w:bookmarkStart w:id="176" w:name="__RefHeading___Toc1970_836002287_Copia_1"/>
-      <w:bookmarkEnd w:id="176"/>
-      <w:r>
-        <w:rPr>
-          <w:rFonts w:eastAsia="Arial" w:cs="Arial"/>
-          <w:b/>
-          <w:bCs/>
-          <w:color w:val="1B3A5C"/>
-          <w:sz w:val="32"/>
-          <w:szCs w:val="32"/>
-        </w:rPr>
-        <w:t>9.1</w:t>
-      </w:r>
-      <w:r>
-        <w:rPr>
-          <w:rFonts w:eastAsia="Arial" w:cs="Arial"/>
-          <w:b/>
-          <w:bCs/>
-          <w:color w:val="1B3A5C"/>
-          <w:sz w:val="32"/>
-          <w:szCs w:val="32"/>
-        </w:rPr>
-        <w:t>0</w:t>
-      </w:r>
-      <w:r>
-        <w:rPr>
-          <w:rFonts w:eastAsia="Arial" w:cs="Arial"/>
-          <w:b/>
-          <w:bCs/>
-          <w:color w:val="1B3A5C"/>
-          <w:sz w:val="32"/>
-          <w:szCs w:val="32"/>
-        </w:rPr>
-        <w:t xml:space="preserve"> </w:t>
+        <w:t xml:space="preserve">9.10 </w:t>
       </w:r>
       <w:r>
         <w:rPr/>
@@ -20191,7 +19994,7 @@
           <w:sz w:val="22"/>
           <w:szCs w:val="22"/>
         </w:rPr>
-        <w:t>El proceso de despliegue con Railway y Railway ha sido una experiencia muy valiosa, ya que ha permitido trabajar con herramientas de DevOps reales: contenedores Docker, variables de entorno para la configuración de producción, bases de datos gestionadas en la nube con SSL y pipelines de despliegue automático desde GitHub. Estas son las mismas herramientas y procesos que se utilizan en el desarrollo profesional de software.</w:t>
+        <w:t>El proceso de despliegue Railway ha sido una experiencia muy valiosa, ya que ha permitido trabajar con herramientas de DevOps reales: contenedores Docker, variables de entorno para la configuración de producción, bases de datos gestionadas en la nube con SSL y pipelines de despliegue automático desde GitHub. Estas son las mismas herramientas y procesos que se utilizan en el desarrollo profesional de software.</w:t>
       </w:r>
     </w:p>
     <w:p>
@@ -23487,14 +23290,14 @@
         </w:tblCellMar>
       </w:tblPr>
       <w:tblGrid>
-        <w:gridCol w:w="3347"/>
-        <w:gridCol w:w="5679"/>
+        <w:gridCol w:w="3346"/>
+        <w:gridCol w:w="5680"/>
       </w:tblGrid>
       <w:tr>
         <w:trPr/>
         <w:tc>
           <w:tcPr>
-            <w:tcW w:w="3347" w:type="dxa"/>
+            <w:tcW w:w="3346" w:type="dxa"/>
             <w:tcBorders>
               <w:top w:val="single" w:sz="2" w:space="0" w:color="CCCCCC"/>
               <w:start w:val="single" w:sz="2" w:space="0" w:color="CCCCCC"/>
@@ -23523,7 +23326,7 @@
         </w:tc>
         <w:tc>
           <w:tcPr>
-            <w:tcW w:w="5679" w:type="dxa"/>
+            <w:tcW w:w="5680" w:type="dxa"/>
             <w:tcBorders>
               <w:top w:val="single" w:sz="2" w:space="0" w:color="CCCCCC"/>
               <w:start w:val="single" w:sz="2" w:space="0" w:color="CCCCCC"/>
@@ -23555,7 +23358,7 @@
         <w:trPr/>
         <w:tc>
           <w:tcPr>
-            <w:tcW w:w="3347" w:type="dxa"/>
+            <w:tcW w:w="3346" w:type="dxa"/>
             <w:tcBorders>
               <w:top w:val="single" w:sz="2" w:space="0" w:color="DDDDDD"/>
               <w:start w:val="single" w:sz="2" w:space="0" w:color="DDDDDD"/>
@@ -23584,7 +23387,7 @@
         </w:tc>
         <w:tc>
           <w:tcPr>
-            <w:tcW w:w="5679" w:type="dxa"/>
+            <w:tcW w:w="5680" w:type="dxa"/>
             <w:tcBorders>
               <w:top w:val="single" w:sz="2" w:space="0" w:color="DDDDDD"/>
               <w:start w:val="single" w:sz="2" w:space="0" w:color="DDDDDD"/>
@@ -23614,7 +23417,7 @@
         <w:trPr/>
         <w:tc>
           <w:tcPr>
-            <w:tcW w:w="3347" w:type="dxa"/>
+            <w:tcW w:w="3346" w:type="dxa"/>
             <w:tcBorders>
               <w:top w:val="single" w:sz="2" w:space="0" w:color="DDDDDD"/>
               <w:start w:val="single" w:sz="2" w:space="0" w:color="DDDDDD"/>
@@ -23643,7 +23446,7 @@
         </w:tc>
         <w:tc>
           <w:tcPr>
-            <w:tcW w:w="5679" w:type="dxa"/>
+            <w:tcW w:w="5680" w:type="dxa"/>
             <w:tcBorders>
               <w:top w:val="single" w:sz="2" w:space="0" w:color="DDDDDD"/>
               <w:start w:val="single" w:sz="2" w:space="0" w:color="DDDDDD"/>
@@ -23673,7 +23476,7 @@
         <w:trPr/>
         <w:tc>
           <w:tcPr>
-            <w:tcW w:w="3347" w:type="dxa"/>
+            <w:tcW w:w="3346" w:type="dxa"/>
             <w:tcBorders>
               <w:top w:val="single" w:sz="2" w:space="0" w:color="DDDDDD"/>
               <w:start w:val="single" w:sz="2" w:space="0" w:color="DDDDDD"/>
@@ -23702,7 +23505,7 @@
         </w:tc>
         <w:tc>
           <w:tcPr>
-            <w:tcW w:w="5679" w:type="dxa"/>
+            <w:tcW w:w="5680" w:type="dxa"/>
             <w:tcBorders>
               <w:top w:val="single" w:sz="2" w:space="0" w:color="DDDDDD"/>
               <w:start w:val="single" w:sz="2" w:space="0" w:color="DDDDDD"/>
@@ -23732,7 +23535,7 @@
         <w:trPr/>
         <w:tc>
           <w:tcPr>
-            <w:tcW w:w="3347" w:type="dxa"/>
+            <w:tcW w:w="3346" w:type="dxa"/>
             <w:tcBorders>
               <w:top w:val="single" w:sz="2" w:space="0" w:color="DDDDDD"/>
               <w:start w:val="single" w:sz="2" w:space="0" w:color="DDDDDD"/>
@@ -23761,7 +23564,7 @@
         </w:tc>
         <w:tc>
           <w:tcPr>
-            <w:tcW w:w="5679" w:type="dxa"/>
+            <w:tcW w:w="5680" w:type="dxa"/>
             <w:tcBorders>
               <w:top w:val="single" w:sz="2" w:space="0" w:color="DDDDDD"/>
               <w:start w:val="single" w:sz="2" w:space="0" w:color="DDDDDD"/>
@@ -23791,7 +23594,7 @@
         <w:trPr/>
         <w:tc>
           <w:tcPr>
-            <w:tcW w:w="3347" w:type="dxa"/>
+            <w:tcW w:w="3346" w:type="dxa"/>
             <w:tcBorders>
               <w:top w:val="single" w:sz="2" w:space="0" w:color="DDDDDD"/>
               <w:start w:val="single" w:sz="2" w:space="0" w:color="DDDDDD"/>
@@ -23820,7 +23623,7 @@
         </w:tc>
         <w:tc>
           <w:tcPr>
-            <w:tcW w:w="5679" w:type="dxa"/>
+            <w:tcW w:w="5680" w:type="dxa"/>
             <w:tcBorders>
               <w:top w:val="single" w:sz="2" w:space="0" w:color="DDDDDD"/>
               <w:start w:val="single" w:sz="2" w:space="0" w:color="DDDDDD"/>
@@ -23850,7 +23653,7 @@
         <w:trPr/>
         <w:tc>
           <w:tcPr>
-            <w:tcW w:w="3347" w:type="dxa"/>
+            <w:tcW w:w="3346" w:type="dxa"/>
             <w:tcBorders>
               <w:top w:val="single" w:sz="2" w:space="0" w:color="DDDDDD"/>
               <w:start w:val="single" w:sz="2" w:space="0" w:color="DDDDDD"/>
@@ -23879,7 +23682,7 @@
         </w:tc>
         <w:tc>
           <w:tcPr>
-            <w:tcW w:w="5679" w:type="dxa"/>
+            <w:tcW w:w="5680" w:type="dxa"/>
             <w:tcBorders>
               <w:top w:val="single" w:sz="2" w:space="0" w:color="DDDDDD"/>
               <w:start w:val="single" w:sz="2" w:space="0" w:color="DDDDDD"/>
@@ -23909,7 +23712,7 @@
         <w:trPr/>
         <w:tc>
           <w:tcPr>
-            <w:tcW w:w="3347" w:type="dxa"/>
+            <w:tcW w:w="3346" w:type="dxa"/>
             <w:tcBorders>
               <w:top w:val="single" w:sz="2" w:space="0" w:color="DDDDDD"/>
               <w:start w:val="single" w:sz="2" w:space="0" w:color="DDDDDD"/>
@@ -23938,7 +23741,7 @@
         </w:tc>
         <w:tc>
           <w:tcPr>
-            <w:tcW w:w="5679" w:type="dxa"/>
+            <w:tcW w:w="5680" w:type="dxa"/>
             <w:tcBorders>
               <w:top w:val="single" w:sz="2" w:space="0" w:color="DDDDDD"/>
               <w:start w:val="single" w:sz="2" w:space="0" w:color="DDDDDD"/>
@@ -24709,25 +24512,7 @@
                 <w:sz w:val="22"/>
                 <w:szCs w:val="22"/>
               </w:rPr>
-              <w:t>2.</w:t>
-            </w:r>
-            <w:r>
-              <w:rPr>
-                <w:rFonts w:eastAsia="Arial" w:cs="Arial"/>
-                <w:color w:val="1A1A2E"/>
-                <w:sz w:val="22"/>
-                <w:szCs w:val="22"/>
-              </w:rPr>
-              <w:t>8</w:t>
-            </w:r>
-            <w:r>
-              <w:rPr>
-                <w:rFonts w:eastAsia="Arial" w:cs="Arial"/>
-                <w:color w:val="1A1A2E"/>
-                <w:sz w:val="22"/>
-                <w:szCs w:val="22"/>
-              </w:rPr>
-              <w:t>.0 Generación automática de Swagger UI y documentación OpenAPI 3.</w:t>
+              <w:t>2.8.0 Generación automática de Swagger UI y documentación OpenAPI 3.</w:t>
             </w:r>
           </w:p>
         </w:tc>
@@ -25477,16 +25262,7 @@
                 <w:sz w:val="22"/>
                 <w:szCs w:val="22"/>
               </w:rPr>
-              <w:t>8</w:t>
-            </w:r>
-            <w:r>
-              <w:rPr>
-                <w:rFonts w:eastAsia="Arial" w:cs="Arial"/>
-                <w:color w:val="1A1A2E"/>
-                <w:sz w:val="22"/>
-                <w:szCs w:val="22"/>
-              </w:rPr>
-              <w:t>.x Core de Capacitor para la integración con plataformas nativas.</w:t>
+              <w:t>8.x Core de Capacitor para la integración con plataformas nativas.</w:t>
             </w:r>
           </w:p>
         </w:tc>
@@ -25545,16 +25321,7 @@
                 <w:sz w:val="22"/>
                 <w:szCs w:val="22"/>
               </w:rPr>
-              <w:t>8</w:t>
-            </w:r>
-            <w:r>
-              <w:rPr>
-                <w:rFonts w:eastAsia="Arial" w:cs="Arial"/>
-                <w:color w:val="1A1A2E"/>
-                <w:sz w:val="22"/>
-                <w:szCs w:val="22"/>
-              </w:rPr>
-              <w:t>.x Plugin de Capacitor para la plataforma Android.</w:t>
+              <w:t>8.x Plugin de Capacitor para la plataforma Android.</w:t>
             </w:r>
           </w:p>
         </w:tc>
@@ -26240,19 +26007,7 @@
           <w:sz w:val="32"/>
           <w:szCs w:val="32"/>
         </w:rPr>
-        <w:t>VII</w:t>
-      </w:r>
-      <w:r>
-        <w:rPr>
-          <w:rStyle w:val="Strong"/>
-          <w:rFonts w:eastAsia="Arial" w:cs="Arial"/>
-          <w:b/>
-          <w:bCs/>
-          <w:color w:val="1B3A5C"/>
-          <w:sz w:val="32"/>
-          <w:szCs w:val="32"/>
-        </w:rPr>
-        <w:t>I</w:t>
+        <w:t>VIII</w:t>
       </w:r>
       <w:r>
         <w:rPr/>
@@ -30359,15 +30114,7 @@
       <w:bookmarkEnd w:id="192"/>
       <w:r>
         <w:rPr/>
-        <w:t xml:space="preserve">Anexo </w:t>
-      </w:r>
-      <w:r>
-        <w:rPr/>
-        <w:t>I</w:t>
-      </w:r>
-      <w:r>
-        <w:rPr/>
-        <w:t>X. Capturas de pantalla de la interfaz</w:t>
+        <w:t>Anexo IX. Capturas de pantalla de la interfaz</w:t>
       </w:r>
     </w:p>
     <w:p>
@@ -32616,7 +32363,14 @@
         </w:rPr>
       </w:pPr>
       <w:r>
-        <w:rPr/>
+        <w:rPr>
+          <w:rFonts w:eastAsia="Arial" w:cs="Arial"/>
+          <w:b/>
+          <w:bCs/>
+          <w:color w:val="1B3A5C"/>
+          <w:sz w:val="32"/>
+          <w:szCs w:val="32"/>
+        </w:rPr>
         <w:drawing>
           <wp:anchor behindDoc="0" distT="0" distB="0" distL="0" distR="0" simplePos="0" locked="0" layoutInCell="0" allowOverlap="1" relativeHeight="22">
             <wp:simplePos x="0" y="0"/>
@@ -32691,29 +32445,7 @@
           <w:sz w:val="32"/>
           <w:szCs w:val="32"/>
         </w:rPr>
-        <w:t>Anexo X</w:t>
-      </w:r>
-      <w:r>
-        <w:rPr>
-          <w:rFonts w:eastAsia="Arial" w:cs="Arial"/>
-          <w:b/>
-          <w:bCs/>
-          <w:color w:val="1B3A5C"/>
-          <w:sz w:val="32"/>
-          <w:szCs w:val="32"/>
-        </w:rPr>
-        <w:t>II</w:t>
-      </w:r>
-      <w:r>
-        <w:rPr>
-          <w:rFonts w:eastAsia="Arial" w:cs="Arial"/>
-          <w:b/>
-          <w:bCs/>
-          <w:color w:val="1B3A5C"/>
-          <w:sz w:val="32"/>
-          <w:szCs w:val="32"/>
-        </w:rPr>
-        <w:t>. Pruebas con Swagger UI</w:t>
+        <w:t>Anexo XII. Pruebas con Swagger UI</w:t>
       </w:r>
     </w:p>
     <w:p>
@@ -46907,7 +46639,7 @@
   </w:style>
   <w:style w:type="paragraph" w:styleId="Heading1">
     <w:name w:val="heading 1"/>
-    <w:basedOn w:val="Ttulouser"/>
+    <w:basedOn w:val="Ttulo"/>
     <w:qFormat/>
     <w:pPr>
       <w:spacing w:before="400" w:after="240"/>
@@ -46924,7 +46656,7 @@
   </w:style>
   <w:style w:type="paragraph" w:styleId="Heading2">
     <w:name w:val="heading 2"/>
-    <w:basedOn w:val="Ttulouser"/>
+    <w:basedOn w:val="Ttulo"/>
     <w:qFormat/>
     <w:pPr>
       <w:spacing w:before="320" w:after="180"/>
@@ -46941,7 +46673,7 @@
   </w:style>
   <w:style w:type="paragraph" w:styleId="Heading3">
     <w:name w:val="heading 3"/>
-    <w:basedOn w:val="Ttulouser"/>
+    <w:basedOn w:val="Ttulo"/>
     <w:qFormat/>
     <w:pPr>
       <w:spacing w:before="240" w:after="140"/>
@@ -46958,7 +46690,7 @@
   </w:style>
   <w:style w:type="paragraph" w:styleId="Heading4">
     <w:name w:val="heading 4"/>
-    <w:basedOn w:val="Ttulouser"/>
+    <w:basedOn w:val="Ttulo"/>
     <w:qFormat/>
     <w:pPr/>
     <w:rPr>
@@ -46969,7 +46701,7 @@
   </w:style>
   <w:style w:type="paragraph" w:styleId="Heading5">
     <w:name w:val="heading 5"/>
-    <w:basedOn w:val="Ttulouser"/>
+    <w:basedOn w:val="Ttulo"/>
     <w:qFormat/>
     <w:pPr/>
     <w:rPr>
@@ -46978,7 +46710,7 @@
   </w:style>
   <w:style w:type="paragraph" w:styleId="Heading6">
     <w:name w:val="heading 6"/>
-    <w:basedOn w:val="Ttulouser"/>
+    <w:basedOn w:val="Ttulo"/>
     <w:qFormat/>
     <w:pPr/>
     <w:rPr>
@@ -46994,8 +46726,8 @@
       <w:u w:val="single"/>
     </w:rPr>
   </w:style>
-  <w:style w:type="character" w:styleId="Caracteresdenotaalpieuser">
-    <w:name w:val="Caracteres de nota al pie (user)"/>
+  <w:style w:type="character" w:styleId="Caracteresdenotaalpie">
+    <w:name w:val="Caracteres de nota al pie"/>
     <w:uiPriority w:val="99"/>
     <w:semiHidden/>
     <w:unhideWhenUsed/>
@@ -47004,8 +46736,8 @@
       <w:vertAlign w:val="superscript"/>
     </w:rPr>
   </w:style>
-  <w:style w:type="character" w:styleId="Caracteresdenotaalpie">
-    <w:name w:val="Caracteres de nota al pie"/>
+  <w:style w:type="character" w:styleId="Caracteresdenotaalpieuser">
+    <w:name w:val="Caracteres de nota al pie (user)"/>
     <w:qFormat/>
     <w:rPr>
       <w:vertAlign w:val="superscript"/>
@@ -47028,8 +46760,8 @@
       <w:szCs w:val="20"/>
     </w:rPr>
   </w:style>
-  <w:style w:type="character" w:styleId="Caracteresdenotafinaluser">
-    <w:name w:val="Caracteres de nota final (user)"/>
+  <w:style w:type="character" w:styleId="Caracteresdenotafinal">
+    <w:name w:val="Caracteres de nota final"/>
     <w:uiPriority w:val="99"/>
     <w:semiHidden/>
     <w:unhideWhenUsed/>
@@ -47038,8 +46770,8 @@
       <w:vertAlign w:val="superscript"/>
     </w:rPr>
   </w:style>
-  <w:style w:type="character" w:styleId="Caracteresdenotafinal">
-    <w:name w:val="Caracteres de nota final"/>
+  <w:style w:type="character" w:styleId="Caracteresdenotafinaluser">
+    <w:name w:val="Caracteres de nota final (user)"/>
     <w:qFormat/>
     <w:rPr>
       <w:vertAlign w:val="superscript"/>
@@ -47062,8 +46794,8 @@
       <w:szCs w:val="20"/>
     </w:rPr>
   </w:style>
-  <w:style w:type="character" w:styleId="Enlacedelndiceuser">
-    <w:name w:val="Enlace del índice (user)"/>
+  <w:style w:type="character" w:styleId="Enlacedelndice">
+    <w:name w:val="Enlace del índice"/>
     <w:qFormat/>
     <w:rPr/>
   </w:style>
@@ -47075,8 +46807,8 @@
       <w:bCs/>
     </w:rPr>
   </w:style>
-  <w:style w:type="character" w:styleId="Enlacedelndice">
-    <w:name w:val="Enlace del índice"/>
+  <w:style w:type="character" w:styleId="Enlacedelndiceuser">
+    <w:name w:val="Enlace del índice (user)"/>
     <w:qFormat/>
     <w:rPr/>
   </w:style>
@@ -47166,7 +46898,7 @@
   </w:style>
   <w:style w:type="paragraph" w:styleId="Title">
     <w:name w:val="Title"/>
-    <w:basedOn w:val="Ttulouser"/>
+    <w:basedOn w:val="Ttulo"/>
     <w:qFormat/>
     <w:pPr/>
     <w:rPr>
@@ -47244,6 +46976,13 @@
       <w:szCs w:val="20"/>
     </w:rPr>
   </w:style>
+  <w:style w:type="paragraph" w:styleId="Cabeceraypie">
+    <w:name w:val="Cabecera y pie"/>
+    <w:basedOn w:val="Normal"/>
+    <w:qFormat/>
+    <w:pPr/>
+    <w:rPr/>
+  </w:style>
   <w:style w:type="paragraph" w:styleId="Cabeceraypieuser">
     <w:name w:val="Cabecera y pie (user)"/>
     <w:basedOn w:val="Normal"/>
@@ -47251,22 +46990,15 @@
     <w:pPr/>
     <w:rPr/>
   </w:style>
-  <w:style w:type="paragraph" w:styleId="Cabeceraypie">
-    <w:name w:val="Cabecera y pie"/>
-    <w:basedOn w:val="Normal"/>
-    <w:qFormat/>
-    <w:pPr/>
-    <w:rPr/>
-  </w:style>
   <w:style w:type="paragraph" w:styleId="Header">
     <w:name w:val="header"/>
-    <w:basedOn w:val="Cabeceraypieuser"/>
+    <w:basedOn w:val="Cabeceraypie"/>
     <w:pPr/>
     <w:rPr/>
   </w:style>
   <w:style w:type="paragraph" w:styleId="IndexHeading">
     <w:name w:val="index heading"/>
-    <w:basedOn w:val="Ttulouser"/>
+    <w:basedOn w:val="Ttulo"/>
     <w:pPr>
       <w:suppressLineNumbers/>
       <w:ind w:hanging="0" w:start="0"/>
@@ -47295,7 +47027,7 @@
   </w:style>
   <w:style w:type="paragraph" w:styleId="TOC1">
     <w:name w:val="toc 1"/>
-    <w:basedOn w:val="ndiceuser"/>
+    <w:basedOn w:val="ndice"/>
     <w:pPr>
       <w:tabs>
         <w:tab w:val="clear" w:pos="720"/>
@@ -47308,7 +47040,7 @@
   </w:style>
   <w:style w:type="paragraph" w:styleId="TOC2">
     <w:name w:val="toc 2"/>
-    <w:basedOn w:val="ndiceuser"/>
+    <w:basedOn w:val="ndice"/>
     <w:pPr>
       <w:tabs>
         <w:tab w:val="clear" w:pos="720"/>
@@ -47320,7 +47052,7 @@
   </w:style>
   <w:style w:type="paragraph" w:styleId="TOC3">
     <w:name w:val="toc 3"/>
-    <w:basedOn w:val="ndiceuser"/>
+    <w:basedOn w:val="ndice"/>
     <w:pPr>
       <w:tabs>
         <w:tab w:val="clear" w:pos="720"/>
@@ -47329,6 +47061,20 @@
       <w:ind w:hanging="0" w:start="567"/>
     </w:pPr>
     <w:rPr/>
+  </w:style>
+  <w:style w:type="paragraph" w:styleId="Comentario">
+    <w:name w:val="Comentario"/>
+    <w:basedOn w:val="Normal"/>
+    <w:qFormat/>
+    <w:pPr>
+      <w:spacing w:lineRule="auto" w:line="240" w:before="56" w:after="0"/>
+      <w:ind w:hanging="0" w:start="57" w:end="57"/>
+    </w:pPr>
+    <w:rPr>
+      <w:color w:val="auto"/>
+      <w:sz w:val="20"/>
+      <w:szCs w:val="20"/>
+    </w:rPr>
   </w:style>
   <w:style w:type="paragraph" w:styleId="Comentariouser">
     <w:name w:val="Comentario (user)"/>
@@ -47344,22 +47090,8 @@
       <w:szCs w:val="20"/>
     </w:rPr>
   </w:style>
-  <w:style w:type="paragraph" w:styleId="Comentario">
-    <w:name w:val="Comentario"/>
-    <w:basedOn w:val="Normal"/>
-    <w:qFormat/>
-    <w:pPr>
-      <w:spacing w:lineRule="auto" w:line="240" w:before="56" w:after="0"/>
-      <w:ind w:hanging="0" w:start="57" w:end="57"/>
-    </w:pPr>
-    <w:rPr>
-      <w:color w:val="auto"/>
-      <w:sz w:val="20"/>
-      <w:szCs w:val="20"/>
-    </w:rPr>
-  </w:style>
-  <w:style w:type="paragraph" w:styleId="Contenidodelatablauser">
-    <w:name w:val="Contenido de la tabla (user)"/>
+  <w:style w:type="paragraph" w:styleId="Contenidodelatabla">
+    <w:name w:val="Contenido de la tabla"/>
     <w:basedOn w:val="Normal"/>
     <w:qFormat/>
     <w:pPr>
@@ -47368,9 +47100,9 @@
     </w:pPr>
     <w:rPr/>
   </w:style>
-  <w:style w:type="paragraph" w:styleId="Ttulodelatablauser">
-    <w:name w:val="Título de la tabla (user)"/>
-    <w:basedOn w:val="Contenidodelatablauser"/>
+  <w:style w:type="paragraph" w:styleId="Ttulodelatabla">
+    <w:name w:val="Título de la tabla"/>
+    <w:basedOn w:val="Contenidodelatabla"/>
     <w:qFormat/>
     <w:pPr>
       <w:suppressLineNumbers/>

</xml_diff>